<commit_message>
Fix creditor selection and map extracted invoice and service facts
</commit_message>
<xml_diff>
--- a/insolvency/stat-demand-and-supporting-affidavit.docx
+++ b/insolvency/stat-demand-and-supporting-affidavit.docx
@@ -1943,6 +1943,44 @@
                 <w:lang w:val="en-AU"/>
               </w:rPr>
             </w:pPr>
+          </w:p>
+        </w:tc>
+      </w:tr>
+      <w:tr>
+        <w:trPr>
+          <w:trHeight w:val="1274"/>
+        </w:trPr>
+        <w:tc>
+          <w:tcPr>
+            <w:tcW w:w="4928" w:type="dxa"/>
+          </w:tcPr>
+          <w:p>
+            <w:pPr>
+              <w:rPr>
+                <w:color w:val="000000"/>
+                <w:sz w:val="22"/>
+                <w:szCs w:val="22"/>
+              </w:rPr>
+            </w:pPr>
+            <w:r>
+              <w:t>{costs_description}</w:t>
+            </w:r>
+          </w:p>
+        </w:tc>
+        <w:tc>
+          <w:tcPr>
+            <w:tcW w:w="4536" w:type="dxa"/>
+          </w:tcPr>
+          <w:p>
+            <w:pPr>
+              <w:rPr>
+                <w:sz w:val="22"/>
+                <w:szCs w:val="22"/>
+              </w:rPr>
+            </w:pPr>
+            <w:r>
+              <w:t>{costs_amount_display}</w:t>
+            </w:r>
           </w:p>
         </w:tc>
       </w:tr>

</xml_diff>

<commit_message>
Align invoice descriptions and amounts in separate schedule rows
</commit_message>
<xml_diff>
--- a/insolvency/stat-demand-and-supporting-affidavit.docx
+++ b/insolvency/stat-demand-and-supporting-affidavit.docx
@@ -1604,210 +1604,22 @@
         <w:gridCol w:w="4536"/>
       </w:tblGrid>
       <w:tr>
-        <w:trPr>
-          <w:trHeight w:val="1274"/>
-        </w:trPr>
         <w:tc>
           <w:tcPr>
             <w:tcW w:w="4928" w:type="dxa"/>
           </w:tcPr>
           <w:p>
             <w:pPr>
-              <w:rPr>
-                <w:color w:val="000000"/>
-                <w:sz w:val="22"/>
-                <w:szCs w:val="22"/>
-              </w:rPr>
-            </w:pPr>
-            <w:bookmarkStart w:id="1" w:name="_Hlk214877922"/>
-          </w:p>
-          <w:bookmarkEnd w:id="1"/>
-          <w:p>
-            <w:pPr>
-              <w:rPr>
-                <w:color w:val="000000"/>
-                <w:sz w:val="22"/>
-                <w:szCs w:val="22"/>
-              </w:rPr>
+              <w:spacing w:after="120"/>
+              <w:jc w:val="left"/>
             </w:pPr>
             <w:r>
               <w:rPr>
-                <w:color w:val="000000"/>
                 <w:sz w:val="22"/>
-                <w:szCs w:val="22"/>
                 <w:highlight w:val="yellow"/>
               </w:rPr>
-              <w:t xml:space="preserve">{invoice1_</w:t>
+              <w:t>{invoice1_description}</w:t>
             </w:r>
-            <w:r>
-              <w:rPr>
-                <w:color w:val="000000"/>
-                <w:sz w:val="22"/>
-                <w:szCs w:val="22"/>
-                <w:highlight w:val="yellow"/>
-              </w:rPr>
-              <w:t xml:space="preserve"/>
-            </w:r>
-            <w:r>
-              <w:rPr>
-                <w:color w:val="000000"/>
-                <w:sz w:val="22"/>
-                <w:szCs w:val="22"/>
-                <w:highlight w:val="yellow"/>
-              </w:rPr>
-              <w:t xml:space="preserve">description}</w:t>
-            </w:r>
-            <w:r>
-              <w:rPr>
-                <w:spacing w:val="-3"/>
-                <w:sz w:val="22"/>
-                <w:szCs w:val="22"/>
-                <w:highlight w:val="yellow"/>
-              </w:rPr>
-              <w:t xml:space="preserve"/>
-            </w:r>
-            <w:r>
-              <w:rPr>
-                <w:spacing w:val="-3"/>
-                <w:sz w:val="22"/>
-                <w:szCs w:val="22"/>
-              </w:rPr>
-              <w:t xml:space="preserve"/>
-            </w:r>
-          </w:p>
-          <w:p>
-            <w:pPr>
-              <w:rPr>
-                <w:color w:val="000000"/>
-                <w:sz w:val="22"/>
-                <w:szCs w:val="22"/>
-              </w:rPr>
-            </w:pPr>
-          </w:p>
-          <w:p>
-            <w:pPr>
-              <w:rPr>
-                <w:color w:val="000000"/>
-                <w:sz w:val="22"/>
-                <w:szCs w:val="22"/>
-              </w:rPr>
-            </w:pPr>
-            <w:r>
-              <w:rPr>
-                <w:color w:val="000000"/>
-                <w:sz w:val="22"/>
-                <w:szCs w:val="22"/>
-                <w:highlight w:val="yellow"/>
-              </w:rPr>
-              <w:t xml:space="preserve">{invoice2_</w:t>
-            </w:r>
-            <w:r>
-              <w:rPr>
-                <w:color w:val="000000"/>
-                <w:sz w:val="22"/>
-                <w:szCs w:val="22"/>
-                <w:highlight w:val="yellow"/>
-              </w:rPr>
-              <w:t xml:space="preserve"/>
-            </w:r>
-            <w:r>
-              <w:rPr>
-                <w:color w:val="000000"/>
-                <w:sz w:val="22"/>
-                <w:szCs w:val="22"/>
-                <w:highlight w:val="yellow"/>
-              </w:rPr>
-              <w:t xml:space="preserve">description}</w:t>
-            </w:r>
-            <w:r>
-              <w:rPr>
-                <w:spacing w:val="-3"/>
-                <w:sz w:val="22"/>
-                <w:szCs w:val="22"/>
-                <w:highlight w:val="yellow"/>
-              </w:rPr>
-              <w:t xml:space="preserve"/>
-            </w:r>
-            <w:r>
-              <w:rPr>
-                <w:spacing w:val="-3"/>
-                <w:sz w:val="22"/>
-                <w:szCs w:val="22"/>
-              </w:rPr>
-              <w:t xml:space="preserve"/>
-            </w:r>
-          </w:p>
-          <w:p>
-            <w:pPr>
-              <w:rPr>
-                <w:color w:val="000000"/>
-                <w:sz w:val="22"/>
-                <w:szCs w:val="22"/>
-              </w:rPr>
-            </w:pPr>
-          </w:p>
-          <w:p>
-            <w:pPr>
-              <w:rPr>
-                <w:color w:val="000000"/>
-                <w:sz w:val="22"/>
-                <w:szCs w:val="22"/>
-              </w:rPr>
-            </w:pPr>
-            <w:r>
-              <w:rPr>
-                <w:color w:val="000000"/>
-                <w:sz w:val="22"/>
-                <w:szCs w:val="22"/>
-                <w:highlight w:val="yellow"/>
-              </w:rPr>
-              <w:t xml:space="preserve">{invoice3_</w:t>
-            </w:r>
-            <w:r>
-              <w:rPr>
-                <w:color w:val="000000"/>
-                <w:sz w:val="22"/>
-                <w:szCs w:val="22"/>
-                <w:highlight w:val="yellow"/>
-              </w:rPr>
-              <w:t xml:space="preserve"/>
-            </w:r>
-            <w:r>
-              <w:rPr>
-                <w:color w:val="000000"/>
-                <w:sz w:val="22"/>
-                <w:szCs w:val="22"/>
-                <w:highlight w:val="yellow"/>
-              </w:rPr>
-              <w:t xml:space="preserve">description}</w:t>
-            </w:r>
-            <w:r>
-              <w:rPr>
-                <w:spacing w:val="-3"/>
-                <w:sz w:val="22"/>
-                <w:szCs w:val="22"/>
-                <w:highlight w:val="yellow"/>
-              </w:rPr>
-              <w:t xml:space="preserve"/>
-            </w:r>
-            <w:r>
-              <w:rPr>
-                <w:spacing w:val="-3"/>
-                <w:sz w:val="22"/>
-                <w:szCs w:val="22"/>
-              </w:rPr>
-              <w:t xml:space="preserve"/>
-            </w:r>
-          </w:p>
-          <w:p>
-            <w:pPr>
-              <w:rPr>
-                <w:color w:val="000000"/>
-                <w:sz w:val="22"/>
-                <w:szCs w:val="22"/>
-                <w:lang w:val="en-AU"/>
-              </w:rPr>
-            </w:pPr>
           </w:p>
         </w:tc>
         <w:tc>
@@ -1816,153 +1628,110 @@
           </w:tcPr>
           <w:p>
             <w:pPr>
-              <w:rPr>
-                <w:sz w:val="22"/>
-                <w:szCs w:val="22"/>
-              </w:rPr>
+              <w:spacing w:after="120"/>
+              <w:jc w:val="right"/>
             </w:pPr>
             <w:r>
               <w:rPr>
                 <w:sz w:val="22"/>
-                <w:szCs w:val="22"/>
-              </w:rPr>
-              <w:t xml:space="preserve">                </w:t>
-            </w:r>
-          </w:p>
-          <w:p>
-            <w:pPr>
-              <w:jc w:val="right"/>
-              <w:rPr>
-                <w:color w:val="000000"/>
-                <w:sz w:val="22"/>
-                <w:szCs w:val="22"/>
-              </w:rPr>
-            </w:pPr>
-            <w:r>
-              <w:rPr>
-                <w:sz w:val="22"/>
-                <w:szCs w:val="22"/>
-              </w:rPr>
-              <w:t xml:space="preserve">{invoice1_amount_display}</w:t>
-            </w:r>
-            <w:r>
-              <w:rPr>
-                <w:spacing w:val="-3"/>
-                <w:sz w:val="22"/>
-                <w:szCs w:val="22"/>
                 <w:highlight w:val="yellow"/>
               </w:rPr>
-              <w:t xml:space="preserve"/>
+              <w:t>{invoice1_amount_display}</w:t>
             </w:r>
-          </w:p>
-          <w:p>
-            <w:pPr>
-              <w:jc w:val="right"/>
-              <w:rPr>
-                <w:sz w:val="22"/>
-                <w:szCs w:val="22"/>
-              </w:rPr>
-            </w:pPr>
-          </w:p>
-          <w:p>
-            <w:pPr>
-              <w:jc w:val="right"/>
-              <w:rPr>
-                <w:sz w:val="22"/>
-                <w:szCs w:val="22"/>
-                <w:lang w:val="en-AU"/>
-              </w:rPr>
-            </w:pPr>
-          </w:p>
-          <w:p>
-            <w:pPr>
-              <w:jc w:val="right"/>
-              <w:rPr>
-                <w:color w:val="000000"/>
-                <w:sz w:val="22"/>
-                <w:szCs w:val="22"/>
-              </w:rPr>
-            </w:pPr>
-            <w:r>
-              <w:rPr>
-                <w:sz w:val="22"/>
-                <w:szCs w:val="22"/>
-              </w:rPr>
-              <w:t xml:space="preserve">{invoice2_amount_display}</w:t>
-            </w:r>
-            <w:r>
-              <w:rPr>
-                <w:spacing w:val="-3"/>
-                <w:sz w:val="22"/>
-                <w:szCs w:val="22"/>
-                <w:highlight w:val="yellow"/>
-              </w:rPr>
-              <w:t xml:space="preserve"/>
-            </w:r>
-          </w:p>
-          <w:p>
-            <w:pPr>
-              <w:rPr>
-                <w:sz w:val="22"/>
-                <w:szCs w:val="22"/>
-              </w:rPr>
-            </w:pPr>
-          </w:p>
-          <w:p>
-            <w:pPr>
-              <w:jc w:val="right"/>
-              <w:rPr>
-                <w:color w:val="000000"/>
-                <w:sz w:val="22"/>
-                <w:szCs w:val="22"/>
-              </w:rPr>
-            </w:pPr>
-            <w:r>
-              <w:rPr>
-                <w:sz w:val="22"/>
-                <w:szCs w:val="22"/>
-              </w:rPr>
-              <w:t xml:space="preserve">{invoice3_amount_display}</w:t>
-            </w:r>
-            <w:r>
-              <w:rPr>
-                <w:spacing w:val="-3"/>
-                <w:sz w:val="22"/>
-                <w:szCs w:val="22"/>
-                <w:highlight w:val="yellow"/>
-              </w:rPr>
-              <w:t xml:space="preserve"/>
-            </w:r>
-          </w:p>
-          <w:p>
-            <w:pPr>
-              <w:jc w:val="right"/>
-              <w:rPr>
-                <w:sz w:val="22"/>
-                <w:szCs w:val="22"/>
-                <w:lang w:val="en-AU"/>
-              </w:rPr>
-            </w:pPr>
           </w:p>
         </w:tc>
       </w:tr>
       <w:tr>
-        <w:trPr>
-          <w:trHeight w:val="1274"/>
-        </w:trPr>
         <w:tc>
           <w:tcPr>
             <w:tcW w:w="4928" w:type="dxa"/>
           </w:tcPr>
           <w:p>
             <w:pPr>
-              <w:rPr>
-                <w:color w:val="000000"/>
-                <w:sz w:val="22"/>
-                <w:szCs w:val="22"/>
-              </w:rPr>
+              <w:spacing w:after="120"/>
+              <w:jc w:val="left"/>
             </w:pPr>
             <w:r>
+              <w:rPr>
+                <w:sz w:val="22"/>
+                <w:highlight w:val="yellow"/>
+              </w:rPr>
+              <w:t>{invoice2_description}</w:t>
+            </w:r>
+          </w:p>
+        </w:tc>
+        <w:tc>
+          <w:tcPr>
+            <w:tcW w:w="4536" w:type="dxa"/>
+          </w:tcPr>
+          <w:p>
+            <w:pPr>
+              <w:spacing w:after="120"/>
+              <w:jc w:val="right"/>
+            </w:pPr>
+            <w:r>
+              <w:rPr>
+                <w:sz w:val="22"/>
+                <w:highlight w:val="yellow"/>
+              </w:rPr>
+              <w:t>{invoice2_amount_display}</w:t>
+            </w:r>
+          </w:p>
+        </w:tc>
+      </w:tr>
+      <w:tr>
+        <w:tc>
+          <w:tcPr>
+            <w:tcW w:w="4928" w:type="dxa"/>
+          </w:tcPr>
+          <w:p>
+            <w:pPr>
+              <w:spacing w:after="120"/>
+              <w:jc w:val="left"/>
+            </w:pPr>
+            <w:r>
+              <w:rPr>
+                <w:sz w:val="22"/>
+                <w:highlight w:val="yellow"/>
+              </w:rPr>
+              <w:t>{invoice3_description}</w:t>
+            </w:r>
+          </w:p>
+        </w:tc>
+        <w:tc>
+          <w:tcPr>
+            <w:tcW w:w="4536" w:type="dxa"/>
+          </w:tcPr>
+          <w:p>
+            <w:pPr>
+              <w:spacing w:after="120"/>
+              <w:jc w:val="right"/>
+            </w:pPr>
+            <w:r>
+              <w:rPr>
+                <w:sz w:val="22"/>
+                <w:highlight w:val="yellow"/>
+              </w:rPr>
+              <w:t>{invoice3_amount_display}</w:t>
+            </w:r>
+          </w:p>
+        </w:tc>
+      </w:tr>
+      <w:tr>
+        <w:tc>
+          <w:tcPr>
+            <w:tcW w:w="4928" w:type="dxa"/>
+          </w:tcPr>
+          <w:p>
+            <w:pPr>
+              <w:spacing w:after="120"/>
+              <w:jc w:val="left"/>
+            </w:pPr>
+            <w:r>
+              <w:rPr>
+                <w:sz w:val="22"/>
+                <w:highlight w:val="yellow"/>
+              </w:rPr>
               <w:t>{costs_description}</w:t>
             </w:r>
           </w:p>
@@ -1973,12 +1742,14 @@
           </w:tcPr>
           <w:p>
             <w:pPr>
+              <w:spacing w:after="120"/>
+              <w:jc w:val="right"/>
+            </w:pPr>
+            <w:r>
               <w:rPr>
                 <w:sz w:val="22"/>
-                <w:szCs w:val="22"/>
+                <w:highlight w:val="yellow"/>
               </w:rPr>
-            </w:pPr>
-            <w:r>
               <w:t>{costs_amount_display}</w:t>
             </w:r>
           </w:p>

</xml_diff>